<commit_message>
Add Chapter 5 to the combined capstone paper
- ToothWise_Chapters_1-5_compressed.pdf: Chapters 1-5 in the paper's
  letterhead style (Chapter 4 pp. 61-83, Chapter 5 pp. 84-87, References
  from p. 88, contents page updated). Lossless copy of the 216 MB build:
  4 MB, all 90 pages identical in text, images, fonts and page size.
- build_chapters_1_5_pdf.py: builds, compresses and verifies the paper;
  build_chapters_1_4_pdf.py now takes parameters and redraws contents.
- generate_chapters_4_and_5_v2.py: Chapter 5 aligned with the real
  test-split results (--with-ch5); refreshed Chapter 4-5 documents.

Survey and screening-time conclusions remain [TBD] placeholders.

Co-Authored-By: Claude Opus 5.5 <noreply@anthropic.com>
</commit_message>
<xml_diff>
--- a/ToothWise_Chapters_4_and_5_v2.docx
+++ b/ToothWise_Chapters_4_and_5_v2.docx
@@ -19743,7 +19743,7 @@
           <w:b w:val="0"/>
           <w:i w:val="0"/>
         </w:rPr>
-        <w:t>Detection of the five classes (Problem 1). Two detection models were trained on 40,271 images merged from four public datasets and evaluated on a held-out test split of 2,930 images. On the test split, YOLOv8 obtained a precision of 54.32%, a recall of 52.34%, an mAP@50 of 51.91%, and an mAP@50-95 of 28.53%; YOLOv12 obtained 52.94%, 50.06%, 48.11%, and 26.28%, respectively, with 24% fewer parameters. The detection accuracy at the deployed threshold was 43.77% for YOLOv8, 41.85% for YOLOv12, and 43.02% for the fused ensemble, whose mAP@50 was 54.24%. Across classes, healthy tooth was detected best and plaque worst. On CPU, the models analyzed an image in 216 ms and 206 ms, and both together in about 507 ms.</w:t>
+        <w:t>Detection of the five classes (Problem 1). Two detection models were trained on 40,271 images merged from four public datasets and evaluated on a held-out test split of 2,930 images. On the test split, YOLOv8 obtained a precision of 54.32%, a recall of 52.34%, an mAP@50 of 51.91%, and an mAP@50-95 of 28.53%; YOLOv12 obtained 52.94%, 50.06%, 48.11%, and 26.28%, respectively, with 24% fewer parameters. The detection accuracy at the deployed threshold was 43.77% for YOLOv8, 41.85% for YOLOv12, and 43.02% for the fused ensemble, whose mAP@50 was 54.24%, the highest of the three. Among the well-represented classes, cavity was detected best; plaque was detected worst, with at most 8.30% of its 554 test instances found. On CPU, the models analyzed an image in 216 ms and 206 ms, and both together in about 507 ms.</w:t>
       </w:r>
     </w:p>
     <w:p>
@@ -19871,7 +19871,7 @@
           <w:b w:val="0"/>
           <w:i w:val="0"/>
         </w:rPr>
-        <w:t>YOLO-based detection on ordinary intraoral photographs can locate and label tartar, plaque, cavity, gum inflammation, and healthy tooth, but with an mAP@50 of 51.91% at best on unseen images, and with large differences between classes (healthy tooth reliable, plaque weak), it is suitable as a screening aid that directs the dentist's attention, not as an independent diagnosis. This confirms the delimitation set in Chapter I.</w:t>
+        <w:t>YOLO-based detection on ordinary intraoral photographs can locate and label tartar, plaque, cavity, gum inflammation, and healthy tooth, but with an mAP@50 on unseen images of 51.91% for the better single model and 54.24% for the fused ensemble, and with large differences between classes (cavity reliable, plaque weak), it is suitable as a screening aid that directs the dentist's attention, not as an independent diagnosis. This confirms the delimitation set in Chapter I.</w:t>
       </w:r>
     </w:p>
     <w:p>
@@ -20074,7 +20074,7 @@
           <w:b w:val="0"/>
           <w:i w:val="0"/>
         </w:rPr>
-        <w:t>Review and harmonize annotations across the merged sources, in particular the healthy tooth and gum inflammation classes, which each come from a single source.</w:t>
+        <w:t>Give priority to plaque, the weakest class (Tables 17 and 18): collect close-up photographs in which it is clearly visible, label it with tight, consistent boxes, and consider a higher input resolution so that thin deposits remain visible to the model.</w:t>
       </w:r>
     </w:p>
     <w:p>
@@ -20086,7 +20086,7 @@
           <w:b w:val="0"/>
           <w:i w:val="0"/>
         </w:rPr>
-        <w:t>Balance the classes through targeted data collection or augmentation, guided by the per-class results in Table 17.</w:t>
+        <w:t>Re-annotate the merged sources so that every image is labeled for all five conditions. The healthy tooth, gum inflammation, and plaque labels each come from a single source, so other images may show these conditions without a label, which both confuses training and inflates the false-alarm counts in evaluation.</w:t>
       </w:r>
     </w:p>
     <w:p>
@@ -20098,7 +20098,19 @@
           <w:b w:val="0"/>
           <w:i w:val="0"/>
         </w:rPr>
-        <w:t>Evaluate both models and the fused ensemble on the held-out test split, and tune the confidence and IoU thresholds of the ensemble on the validation split.</w:t>
+        <w:t>Enlarge the healthy tooth test set; with only 42 labeled instances its high score cannot yet be relied upon.</w:t>
+      </w:r>
+    </w:p>
+    <w:p>
+      <w:pPr>
+        <w:pStyle w:val="ListBullet"/>
+      </w:pPr>
+      <w:r>
+        <w:rPr>
+          <w:b w:val="0"/>
+          <w:i w:val="0"/>
+        </w:rPr>
+        <w:t>Tune the confidence threshold and fusion settings of the ensemble on the validation split. The ensemble missed fewer findings than the better single model (2,216 against 2,874) but raised more false alarms (3,574 against 1,992); a slightly higher threshold for findings reported by only one model may keep most of the gain with fewer false alarms.</w:t>
       </w:r>
     </w:p>
     <w:p>

</xml_diff>